<commit_message>
feat: training management overhaul - specialists, ledger types, evaluation templates, attendance
- Training specialists management page with department/person mapping
- SOP/Event ledger types with type selection modal
- Evaluation form templates (.xlsx for old, .docx for new)
- Sign-in sheet template fixes
- Training notification template factory separation
- Auto-send select tasks on training creation
- Attendance management module
- Ledger export based on factory and type
- Selection progress tracking in training list

Co-Authored-By: Claude <noreply@anthropic.com>
</commit_message>
<xml_diff>
--- a/dazah-backend/新厂人员培训管理规程/R-GN-2002 H 培训效果评估表.docx
+++ b/dazah-backend/新厂人员培训管理规程/R-GN-2002 H 培训效果评估表.docx
@@ -81,17 +81,6 @@
               </w:rPr>
               <w:t>培训内容：</w:t>
             </w:r>
-            <w:r>
-              <w:rPr>
-                <w:rFonts w:hint="eastAsia" w:ascii="宋体" w:hAnsi="宋体" w:eastAsia="宋体" w:cs="宋体"/>
-                <w:color w:val="auto"/>
-                <w:sz w:val="21"/>
-                <w:szCs w:val="21"/>
-                <w:u w:val="none"/>
-                <w:lang w:val="en-US" w:eastAsia="zh-CN"/>
-              </w:rPr>
-              <w:t>产品放行管理规程、物料/产品取样与检验管理规程</w:t>
-            </w:r>
           </w:p>
         </w:tc>
       </w:tr>
@@ -168,16 +157,6 @@
                 <w:lang w:val="en-US" w:eastAsia="zh-CN"/>
               </w:rPr>
             </w:pPr>
-            <w:r>
-              <w:rPr>
-                <w:rFonts w:hint="default" w:ascii="Times New Roman" w:hAnsi="Times New Roman" w:cs="Times New Roman"/>
-                <w:color w:val="000000"/>
-                <w:sz w:val="21"/>
-                <w:szCs w:val="21"/>
-                <w:lang w:val="en-US" w:eastAsia="zh-CN"/>
-              </w:rPr>
-              <w:t>2026.01.09</w:t>
-            </w:r>
           </w:p>
         </w:tc>
         <w:tc>
@@ -232,16 +211,6 @@
                 <w:lang w:val="en-US" w:eastAsia="zh-CN"/>
               </w:rPr>
             </w:pPr>
-            <w:r>
-              <w:rPr>
-                <w:rFonts w:hint="default" w:ascii="Times New Roman" w:hAnsi="Times New Roman" w:cs="Times New Roman"/>
-                <w:color w:val="000000"/>
-                <w:sz w:val="21"/>
-                <w:szCs w:val="21"/>
-                <w:lang w:val="en-US" w:eastAsia="zh-CN"/>
-              </w:rPr>
-              <w:t>1.0H</w:t>
-            </w:r>
           </w:p>
         </w:tc>
       </w:tr>
@@ -380,16 +349,6 @@
                 <w:lang w:val="en-US" w:eastAsia="zh-CN"/>
               </w:rPr>
             </w:pPr>
-            <w:r>
-              <w:rPr>
-                <w:rFonts w:hint="eastAsia" w:ascii="宋体" w:hAnsi="宋体" w:cs="宋体"/>
-                <w:color w:val="000000"/>
-                <w:sz w:val="21"/>
-                <w:szCs w:val="21"/>
-                <w:lang w:val="en-US" w:eastAsia="zh-CN"/>
-              </w:rPr>
-              <w:t>邹良财</w:t>
-            </w:r>
           </w:p>
         </w:tc>
       </w:tr>
@@ -477,50 +436,6 @@
                 <w:lang w:val="en-US" w:eastAsia="zh-CN"/>
               </w:rPr>
               <w:t xml:space="preserve"> </w:t>
-            </w:r>
-            <w:r>
-              <w:rPr>
-                <w:rFonts w:hint="eastAsia" w:ascii="宋体" w:hAnsi="宋体" w:eastAsia="宋体" w:cs="宋体"/>
-                <w:color w:val="auto"/>
-                <w:sz w:val="21"/>
-                <w:szCs w:val="21"/>
-                <w:u w:val="none"/>
-                <w:lang w:val="en-US" w:eastAsia="zh-CN"/>
-              </w:rPr>
-              <w:t>产品放行管理规程</w:t>
-            </w:r>
-            <w:r>
-              <w:rPr>
-                <w:rFonts w:hint="default" w:ascii="Times New Roman" w:hAnsi="Times New Roman" w:eastAsia="宋体" w:cs="Times New Roman"/>
-                <w:color w:val="auto"/>
-                <w:sz w:val="21"/>
-                <w:szCs w:val="21"/>
-                <w:u w:val="none"/>
-                <w:lang w:val="en-US" w:eastAsia="zh-CN"/>
-              </w:rPr>
-              <w:t xml:space="preserve"> SOP-GN-7004/07</w:t>
-            </w:r>
-            <w:r>
-              <w:rPr>
-                <w:rFonts w:hint="eastAsia" w:ascii="宋体" w:hAnsi="宋体" w:eastAsia="宋体" w:cs="宋体"/>
-                <w:color w:val="auto"/>
-                <w:sz w:val="21"/>
-                <w:szCs w:val="21"/>
-                <w:u w:val="none"/>
-                <w:lang w:val="en-US" w:eastAsia="zh-CN"/>
-              </w:rPr>
-              <w:t>、物料/产品取样与检验管理规程</w:t>
-            </w:r>
-            <w:r>
-              <w:rPr>
-                <w:rFonts w:hint="default" w:ascii="Times New Roman" w:hAnsi="Times New Roman" w:eastAsia="宋体" w:cs="Times New Roman"/>
-                <w:color w:val="auto"/>
-                <w:sz w:val="21"/>
-                <w:szCs w:val="21"/>
-                <w:u w:val="none"/>
-                <w:lang w:val="en-US" w:eastAsia="zh-CN"/>
-              </w:rPr>
-              <w:t>SOP-GN-3045/04</w:t>
             </w:r>
           </w:p>
           <w:p>
@@ -621,39 +536,8 @@
               </w:rPr>
               <w:t>部门/班组/人员：</w:t>
             </w:r>
-            <w:r>
-              <w:rPr>
-                <w:rFonts w:hint="default" w:ascii="Times New Roman" w:hAnsi="Times New Roman" w:eastAsia="宋体" w:cs="Times New Roman"/>
-                <w:color w:val="auto"/>
-                <w:sz w:val="21"/>
-                <w:szCs w:val="21"/>
-                <w:u w:val="none"/>
-                <w:lang w:val="en-US" w:eastAsia="zh-CN"/>
-              </w:rPr>
-              <w:t>QA、QC、</w:t>
-            </w:r>
-            <w:r>
-              <w:rPr>
-                <w:rFonts w:hint="default" w:ascii="Times New Roman" w:hAnsi="Times New Roman" w:eastAsia="宋体" w:cs="Times New Roman"/>
-                <w:color w:val="auto"/>
-                <w:sz w:val="21"/>
-                <w:szCs w:val="21"/>
-                <w:u w:val="none"/>
-                <w:lang w:val="en-US" w:eastAsia="zh-CN"/>
-              </w:rPr>
-              <w:t>仓储部、生产部</w:t>
-            </w:r>
-            <w:r>
-              <w:rPr>
-                <w:rFonts w:hint="eastAsia" w:ascii="Times New Roman" w:hAnsi="Times New Roman" w:eastAsia="宋体" w:cs="Times New Roman"/>
-                <w:color w:val="auto"/>
-                <w:sz w:val="21"/>
-                <w:szCs w:val="21"/>
-                <w:u w:val="none"/>
-                <w:lang w:val="en-US" w:eastAsia="zh-CN"/>
-              </w:rPr>
-              <w:t xml:space="preserve">   </w:t>
-            </w:r>
+            <w:bookmarkStart w:id="1" w:name="_GoBack"/>
+            <w:bookmarkEnd w:id="1"/>
           </w:p>
         </w:tc>
       </w:tr>
@@ -896,8 +780,6 @@
               </w:rPr>
               <w:t>再培训（时间、地点、方式等）：</w:t>
             </w:r>
-            <w:bookmarkStart w:id="1" w:name="_GoBack"/>
-            <w:bookmarkEnd w:id="1"/>
           </w:p>
         </w:tc>
       </w:tr>

</xml_diff>